<commit_message>
Add verified six-run retraining results and comparable loss curves
</commit_message>
<xml_diff>
--- a/results/sts/manuscript/STS_Expanded_Results.docx
+++ b/results/sts/manuscript/STS_Expanded_Results.docx
@@ -4561,8 +4561,1592 @@
         </w:r>
       </w:hyperlink>
     </w:p>
+    <w:p>
+      <w:r>
+        <w:br w:type="page"/>
+      </w:r>
+    </w:p>
+    <w:p>
+      <w:pPr>
+        <w:pStyle w:val="Heading1"/>
+      </w:pPr>
+      <w:r>
+        <w:t>New retraining with comparable learning curves</w:t>
+      </w:r>
+    </w:p>
+    <w:p>
+      <w:pPr/>
+      <w:r>
+        <w:t>A separate October 18 experiment completed 6 runs and 329 epochs, using stage-only and multitask conditions with three seeds each. At every epoch end, the same fixed checkpoint was evaluated on all 19,023 training and 2,705 validation images with the same clean transform, evaluation mode and unweighted, unsmoothed negative log-likelihood (NLL). Table 4 and Figure 3 report these new measurements; Tables 1 to 3 retain the historical October 11 results.</w:t>
+      </w:r>
+    </w:p>
+    <w:p>
+      <w:pPr>
+        <w:pStyle w:val="Caption"/>
+        <w:keepNext/>
+      </w:pPr>
+      <w:r>
+        <w:t>Table 4. New retraining epochs and clean NLL at the validation-selected checkpoint.</w:t>
+      </w:r>
+    </w:p>
+    <w:tbl>
+      <w:tblPr>
+        <w:tblW w:type="auto" w:w="0"/>
+        <w:jc w:val="center"/>
+        <w:tblLayout w:type="fixed"/>
+        <w:tblLook w:firstColumn="1" w:firstRow="1" w:lastColumn="0" w:lastRow="0" w:noHBand="0" w:noVBand="1" w:val="04A0"/>
+      </w:tblPr>
+      <w:tblGrid>
+        <w:gridCol w:w="1680"/>
+        <w:gridCol w:w="1680"/>
+        <w:gridCol w:w="1680"/>
+        <w:gridCol w:w="1680"/>
+        <w:gridCol w:w="1680"/>
+        <w:gridCol w:w="1680"/>
+      </w:tblGrid>
+      <w:tr>
+        <w:trPr>
+          <w:cantSplit/>
+          <w:tblHeader/>
+        </w:trPr>
+        <w:tc>
+          <w:tcPr>
+            <w:tcW w:type="dxa" w:w="1733"/>
+            <w:vAlign w:val="center"/>
+            <w:tcBorders>
+              <w:top w:val="single" w:sz="4" w:color="D9D9D9"/>
+              <w:left w:val="single" w:sz="4" w:color="D9D9D9"/>
+              <w:bottom w:val="single" w:sz="4" w:color="D9D9D9"/>
+              <w:right w:val="single" w:sz="4" w:color="D9D9D9"/>
+            </w:tcBorders>
+            <w:tcMar>
+              <w:top w:w="65" w:type="dxa"/>
+              <w:left w:w="65" w:type="dxa"/>
+              <w:bottom w:w="65" w:type="dxa"/>
+              <w:right w:w="65" w:type="dxa"/>
+            </w:tcMar>
+            <w:shd w:fill="E3EAF0"/>
+          </w:tcPr>
+          <w:p>
+            <w:pPr>
+              <w:spacing w:after="0" w:line="240" w:lineRule="auto"/>
+              <w:jc w:val="left"/>
+            </w:pPr>
+            <w:r>
+              <w:rPr>
+                <w:b/>
+                <w:sz w:val="18"/>
+              </w:rPr>
+              <w:t>Condition</w:t>
+            </w:r>
+          </w:p>
+        </w:tc>
+        <w:tc>
+          <w:tcPr>
+            <w:tcW w:type="dxa" w:w="1733"/>
+            <w:vAlign w:val="center"/>
+            <w:tcBorders>
+              <w:top w:val="single" w:sz="4" w:color="D9D9D9"/>
+              <w:left w:val="single" w:sz="4" w:color="D9D9D9"/>
+              <w:bottom w:val="single" w:sz="4" w:color="D9D9D9"/>
+              <w:right w:val="single" w:sz="4" w:color="D9D9D9"/>
+            </w:tcBorders>
+            <w:tcMar>
+              <w:top w:w="65" w:type="dxa"/>
+              <w:left w:w="65" w:type="dxa"/>
+              <w:bottom w:w="65" w:type="dxa"/>
+              <w:right w:w="65" w:type="dxa"/>
+            </w:tcMar>
+            <w:shd w:fill="E3EAF0"/>
+          </w:tcPr>
+          <w:p>
+            <w:pPr>
+              <w:spacing w:after="0" w:line="240" w:lineRule="auto"/>
+              <w:jc w:val="center"/>
+            </w:pPr>
+            <w:r>
+              <w:rPr>
+                <w:b/>
+                <w:sz w:val="18"/>
+              </w:rPr>
+              <w:t>Seed</w:t>
+            </w:r>
+          </w:p>
+        </w:tc>
+        <w:tc>
+          <w:tcPr>
+            <w:tcW w:type="dxa" w:w="1393"/>
+            <w:vAlign w:val="center"/>
+            <w:tcBorders>
+              <w:top w:val="single" w:sz="4" w:color="D9D9D9"/>
+              <w:left w:val="single" w:sz="4" w:color="D9D9D9"/>
+              <w:bottom w:val="single" w:sz="4" w:color="D9D9D9"/>
+              <w:right w:val="single" w:sz="4" w:color="D9D9D9"/>
+            </w:tcBorders>
+            <w:tcMar>
+              <w:top w:w="65" w:type="dxa"/>
+              <w:left w:w="65" w:type="dxa"/>
+              <w:bottom w:w="65" w:type="dxa"/>
+              <w:right w:w="65" w:type="dxa"/>
+            </w:tcMar>
+            <w:shd w:fill="E3EAF0"/>
+          </w:tcPr>
+          <w:p>
+            <w:pPr>
+              <w:spacing w:after="0" w:line="240" w:lineRule="auto"/>
+              <w:jc w:val="center"/>
+            </w:pPr>
+            <w:r>
+              <w:rPr>
+                <w:b/>
+                <w:sz w:val="18"/>
+              </w:rPr>
+              <w:t>Completed</w:t>
+            </w:r>
+          </w:p>
+        </w:tc>
+        <w:tc>
+          <w:tcPr>
+            <w:tcW w:type="dxa" w:w="1291"/>
+            <w:vAlign w:val="center"/>
+            <w:tcBorders>
+              <w:top w:val="single" w:sz="4" w:color="D9D9D9"/>
+              <w:left w:val="single" w:sz="4" w:color="D9D9D9"/>
+              <w:bottom w:val="single" w:sz="4" w:color="D9D9D9"/>
+              <w:right w:val="single" w:sz="4" w:color="D9D9D9"/>
+            </w:tcBorders>
+            <w:tcMar>
+              <w:top w:w="65" w:type="dxa"/>
+              <w:left w:w="65" w:type="dxa"/>
+              <w:bottom w:w="65" w:type="dxa"/>
+              <w:right w:w="65" w:type="dxa"/>
+            </w:tcMar>
+            <w:shd w:fill="E3EAF0"/>
+          </w:tcPr>
+          <w:p>
+            <w:pPr>
+              <w:spacing w:after="0" w:line="240" w:lineRule="auto"/>
+              <w:jc w:val="center"/>
+            </w:pPr>
+            <w:r>
+              <w:rPr>
+                <w:b/>
+                <w:sz w:val="18"/>
+              </w:rPr>
+              <w:t>Selected</w:t>
+            </w:r>
+          </w:p>
+        </w:tc>
+        <w:tc>
+          <w:tcPr>
+            <w:tcW w:type="dxa" w:w="1631"/>
+            <w:vAlign w:val="center"/>
+            <w:tcBorders>
+              <w:top w:val="single" w:sz="4" w:color="D9D9D9"/>
+              <w:left w:val="single" w:sz="4" w:color="D9D9D9"/>
+              <w:bottom w:val="single" w:sz="4" w:color="D9D9D9"/>
+              <w:right w:val="single" w:sz="4" w:color="D9D9D9"/>
+            </w:tcBorders>
+            <w:tcMar>
+              <w:top w:w="65" w:type="dxa"/>
+              <w:left w:w="65" w:type="dxa"/>
+              <w:bottom w:w="65" w:type="dxa"/>
+              <w:right w:w="65" w:type="dxa"/>
+            </w:tcMar>
+            <w:shd w:fill="E3EAF0"/>
+          </w:tcPr>
+          <w:p>
+            <w:pPr>
+              <w:spacing w:after="0" w:line="240" w:lineRule="auto"/>
+              <w:jc w:val="center"/>
+            </w:pPr>
+            <w:r>
+              <w:rPr>
+                <w:b/>
+                <w:sz w:val="18"/>
+              </w:rPr>
+              <w:t>Train NLL</w:t>
+            </w:r>
+          </w:p>
+        </w:tc>
+        <w:tc>
+          <w:tcPr>
+            <w:tcW w:type="dxa" w:w="1631"/>
+            <w:vAlign w:val="center"/>
+            <w:tcBorders>
+              <w:top w:val="single" w:sz="4" w:color="D9D9D9"/>
+              <w:left w:val="single" w:sz="4" w:color="D9D9D9"/>
+              <w:bottom w:val="single" w:sz="4" w:color="D9D9D9"/>
+              <w:right w:val="single" w:sz="4" w:color="D9D9D9"/>
+            </w:tcBorders>
+            <w:tcMar>
+              <w:top w:w="65" w:type="dxa"/>
+              <w:left w:w="65" w:type="dxa"/>
+              <w:bottom w:w="65" w:type="dxa"/>
+              <w:right w:w="65" w:type="dxa"/>
+            </w:tcMar>
+            <w:shd w:fill="E3EAF0"/>
+          </w:tcPr>
+          <w:p>
+            <w:pPr>
+              <w:spacing w:after="0" w:line="240" w:lineRule="auto"/>
+              <w:jc w:val="center"/>
+            </w:pPr>
+            <w:r>
+              <w:rPr>
+                <w:b/>
+                <w:sz w:val="18"/>
+              </w:rPr>
+              <w:t>Val NLL</w:t>
+            </w:r>
+          </w:p>
+        </w:tc>
+      </w:tr>
+      <w:tr>
+        <w:trPr>
+          <w:cantSplit/>
+        </w:trPr>
+        <w:tc>
+          <w:tcPr>
+            <w:tcW w:type="dxa" w:w="1733"/>
+            <w:vAlign w:val="center"/>
+            <w:tcBorders>
+              <w:top w:val="single" w:sz="4" w:color="D9D9D9"/>
+              <w:left w:val="single" w:sz="4" w:color="D9D9D9"/>
+              <w:bottom w:val="single" w:sz="4" w:color="D9D9D9"/>
+              <w:right w:val="single" w:sz="4" w:color="D9D9D9"/>
+            </w:tcBorders>
+            <w:tcMar>
+              <w:top w:w="65" w:type="dxa"/>
+              <w:left w:w="65" w:type="dxa"/>
+              <w:bottom w:w="65" w:type="dxa"/>
+              <w:right w:w="65" w:type="dxa"/>
+            </w:tcMar>
+            <w:shd w:fill="FFFFFF"/>
+          </w:tcPr>
+          <w:p>
+            <w:pPr>
+              <w:spacing w:after="0" w:line="240" w:lineRule="auto"/>
+              <w:jc w:val="left"/>
+            </w:pPr>
+            <w:r>
+              <w:rPr>
+                <w:b w:val="0"/>
+                <w:sz w:val="18"/>
+              </w:rPr>
+              <w:t>Stage only</w:t>
+            </w:r>
+          </w:p>
+        </w:tc>
+        <w:tc>
+          <w:tcPr>
+            <w:tcW w:type="dxa" w:w="1733"/>
+            <w:vAlign w:val="center"/>
+            <w:tcBorders>
+              <w:top w:val="single" w:sz="4" w:color="D9D9D9"/>
+              <w:left w:val="single" w:sz="4" w:color="D9D9D9"/>
+              <w:bottom w:val="single" w:sz="4" w:color="D9D9D9"/>
+              <w:right w:val="single" w:sz="4" w:color="D9D9D9"/>
+            </w:tcBorders>
+            <w:tcMar>
+              <w:top w:w="65" w:type="dxa"/>
+              <w:left w:w="65" w:type="dxa"/>
+              <w:bottom w:w="65" w:type="dxa"/>
+              <w:right w:w="65" w:type="dxa"/>
+            </w:tcMar>
+            <w:shd w:fill="FFFFFF"/>
+          </w:tcPr>
+          <w:p>
+            <w:pPr>
+              <w:spacing w:after="0" w:line="240" w:lineRule="auto"/>
+              <w:jc w:val="center"/>
+            </w:pPr>
+            <w:r>
+              <w:rPr>
+                <w:b w:val="0"/>
+                <w:sz w:val="18"/>
+              </w:rPr>
+              <w:t>20261011</w:t>
+            </w:r>
+          </w:p>
+        </w:tc>
+        <w:tc>
+          <w:tcPr>
+            <w:tcW w:type="dxa" w:w="1393"/>
+            <w:vAlign w:val="center"/>
+            <w:tcBorders>
+              <w:top w:val="single" w:sz="4" w:color="D9D9D9"/>
+              <w:left w:val="single" w:sz="4" w:color="D9D9D9"/>
+              <w:bottom w:val="single" w:sz="4" w:color="D9D9D9"/>
+              <w:right w:val="single" w:sz="4" w:color="D9D9D9"/>
+            </w:tcBorders>
+            <w:tcMar>
+              <w:top w:w="65" w:type="dxa"/>
+              <w:left w:w="65" w:type="dxa"/>
+              <w:bottom w:w="65" w:type="dxa"/>
+              <w:right w:w="65" w:type="dxa"/>
+            </w:tcMar>
+            <w:shd w:fill="FFFFFF"/>
+          </w:tcPr>
+          <w:p>
+            <w:pPr>
+              <w:spacing w:after="0" w:line="240" w:lineRule="auto"/>
+              <w:jc w:val="center"/>
+            </w:pPr>
+            <w:r>
+              <w:rPr>
+                <w:b w:val="0"/>
+                <w:sz w:val="18"/>
+              </w:rPr>
+              <w:t>42</w:t>
+            </w:r>
+          </w:p>
+        </w:tc>
+        <w:tc>
+          <w:tcPr>
+            <w:tcW w:type="dxa" w:w="1291"/>
+            <w:vAlign w:val="center"/>
+            <w:tcBorders>
+              <w:top w:val="single" w:sz="4" w:color="D9D9D9"/>
+              <w:left w:val="single" w:sz="4" w:color="D9D9D9"/>
+              <w:bottom w:val="single" w:sz="4" w:color="D9D9D9"/>
+              <w:right w:val="single" w:sz="4" w:color="D9D9D9"/>
+            </w:tcBorders>
+            <w:tcMar>
+              <w:top w:w="65" w:type="dxa"/>
+              <w:left w:w="65" w:type="dxa"/>
+              <w:bottom w:w="65" w:type="dxa"/>
+              <w:right w:w="65" w:type="dxa"/>
+            </w:tcMar>
+            <w:shd w:fill="FFFFFF"/>
+          </w:tcPr>
+          <w:p>
+            <w:pPr>
+              <w:spacing w:after="0" w:line="240" w:lineRule="auto"/>
+              <w:jc w:val="center"/>
+            </w:pPr>
+            <w:r>
+              <w:rPr>
+                <w:b w:val="0"/>
+                <w:sz w:val="18"/>
+              </w:rPr>
+              <w:t>27</w:t>
+            </w:r>
+          </w:p>
+        </w:tc>
+        <w:tc>
+          <w:tcPr>
+            <w:tcW w:type="dxa" w:w="1631"/>
+            <w:vAlign w:val="center"/>
+            <w:tcBorders>
+              <w:top w:val="single" w:sz="4" w:color="D9D9D9"/>
+              <w:left w:val="single" w:sz="4" w:color="D9D9D9"/>
+              <w:bottom w:val="single" w:sz="4" w:color="D9D9D9"/>
+              <w:right w:val="single" w:sz="4" w:color="D9D9D9"/>
+            </w:tcBorders>
+            <w:tcMar>
+              <w:top w:w="65" w:type="dxa"/>
+              <w:left w:w="65" w:type="dxa"/>
+              <w:bottom w:w="65" w:type="dxa"/>
+              <w:right w:w="65" w:type="dxa"/>
+            </w:tcMar>
+            <w:shd w:fill="FFFFFF"/>
+          </w:tcPr>
+          <w:p>
+            <w:pPr>
+              <w:spacing w:after="0" w:line="240" w:lineRule="auto"/>
+              <w:jc w:val="center"/>
+            </w:pPr>
+            <w:r>
+              <w:rPr>
+                <w:b w:val="0"/>
+                <w:sz w:val="18"/>
+              </w:rPr>
+              <w:t>0.034431</w:t>
+            </w:r>
+          </w:p>
+        </w:tc>
+        <w:tc>
+          <w:tcPr>
+            <w:tcW w:type="dxa" w:w="1631"/>
+            <w:vAlign w:val="center"/>
+            <w:tcBorders>
+              <w:top w:val="single" w:sz="4" w:color="D9D9D9"/>
+              <w:left w:val="single" w:sz="4" w:color="D9D9D9"/>
+              <w:bottom w:val="single" w:sz="4" w:color="D9D9D9"/>
+              <w:right w:val="single" w:sz="4" w:color="D9D9D9"/>
+            </w:tcBorders>
+            <w:tcMar>
+              <w:top w:w="65" w:type="dxa"/>
+              <w:left w:w="65" w:type="dxa"/>
+              <w:bottom w:w="65" w:type="dxa"/>
+              <w:right w:w="65" w:type="dxa"/>
+            </w:tcMar>
+            <w:shd w:fill="FFFFFF"/>
+          </w:tcPr>
+          <w:p>
+            <w:pPr>
+              <w:spacing w:after="0" w:line="240" w:lineRule="auto"/>
+              <w:jc w:val="center"/>
+            </w:pPr>
+            <w:r>
+              <w:rPr>
+                <w:b w:val="0"/>
+                <w:sz w:val="18"/>
+              </w:rPr>
+              <w:t>0.036154</w:t>
+            </w:r>
+          </w:p>
+        </w:tc>
+      </w:tr>
+      <w:tr>
+        <w:trPr>
+          <w:cantSplit/>
+        </w:trPr>
+        <w:tc>
+          <w:tcPr>
+            <w:tcW w:type="dxa" w:w="1733"/>
+            <w:vAlign w:val="center"/>
+            <w:tcBorders>
+              <w:top w:val="single" w:sz="4" w:color="D9D9D9"/>
+              <w:left w:val="single" w:sz="4" w:color="D9D9D9"/>
+              <w:bottom w:val="single" w:sz="4" w:color="D9D9D9"/>
+              <w:right w:val="single" w:sz="4" w:color="D9D9D9"/>
+            </w:tcBorders>
+            <w:tcMar>
+              <w:top w:w="65" w:type="dxa"/>
+              <w:left w:w="65" w:type="dxa"/>
+              <w:bottom w:w="65" w:type="dxa"/>
+              <w:right w:w="65" w:type="dxa"/>
+            </w:tcMar>
+            <w:shd w:fill="F5F6F7"/>
+          </w:tcPr>
+          <w:p>
+            <w:pPr>
+              <w:spacing w:after="0" w:line="240" w:lineRule="auto"/>
+              <w:jc w:val="left"/>
+            </w:pPr>
+            <w:r>
+              <w:rPr>
+                <w:b w:val="0"/>
+                <w:sz w:val="18"/>
+              </w:rPr>
+              <w:t>Multitask</w:t>
+            </w:r>
+          </w:p>
+        </w:tc>
+        <w:tc>
+          <w:tcPr>
+            <w:tcW w:type="dxa" w:w="1733"/>
+            <w:vAlign w:val="center"/>
+            <w:tcBorders>
+              <w:top w:val="single" w:sz="4" w:color="D9D9D9"/>
+              <w:left w:val="single" w:sz="4" w:color="D9D9D9"/>
+              <w:bottom w:val="single" w:sz="4" w:color="D9D9D9"/>
+              <w:right w:val="single" w:sz="4" w:color="D9D9D9"/>
+            </w:tcBorders>
+            <w:tcMar>
+              <w:top w:w="65" w:type="dxa"/>
+              <w:left w:w="65" w:type="dxa"/>
+              <w:bottom w:w="65" w:type="dxa"/>
+              <w:right w:w="65" w:type="dxa"/>
+            </w:tcMar>
+            <w:shd w:fill="F5F6F7"/>
+          </w:tcPr>
+          <w:p>
+            <w:pPr>
+              <w:spacing w:after="0" w:line="240" w:lineRule="auto"/>
+              <w:jc w:val="center"/>
+            </w:pPr>
+            <w:r>
+              <w:rPr>
+                <w:b w:val="0"/>
+                <w:sz w:val="18"/>
+              </w:rPr>
+              <w:t>20261011</w:t>
+            </w:r>
+          </w:p>
+        </w:tc>
+        <w:tc>
+          <w:tcPr>
+            <w:tcW w:type="dxa" w:w="1393"/>
+            <w:vAlign w:val="center"/>
+            <w:tcBorders>
+              <w:top w:val="single" w:sz="4" w:color="D9D9D9"/>
+              <w:left w:val="single" w:sz="4" w:color="D9D9D9"/>
+              <w:bottom w:val="single" w:sz="4" w:color="D9D9D9"/>
+              <w:right w:val="single" w:sz="4" w:color="D9D9D9"/>
+            </w:tcBorders>
+            <w:tcMar>
+              <w:top w:w="65" w:type="dxa"/>
+              <w:left w:w="65" w:type="dxa"/>
+              <w:bottom w:w="65" w:type="dxa"/>
+              <w:right w:w="65" w:type="dxa"/>
+            </w:tcMar>
+            <w:shd w:fill="F5F6F7"/>
+          </w:tcPr>
+          <w:p>
+            <w:pPr>
+              <w:spacing w:after="0" w:line="240" w:lineRule="auto"/>
+              <w:jc w:val="center"/>
+            </w:pPr>
+            <w:r>
+              <w:rPr>
+                <w:b w:val="0"/>
+                <w:sz w:val="18"/>
+              </w:rPr>
+              <w:t>67</w:t>
+            </w:r>
+          </w:p>
+        </w:tc>
+        <w:tc>
+          <w:tcPr>
+            <w:tcW w:type="dxa" w:w="1291"/>
+            <w:vAlign w:val="center"/>
+            <w:tcBorders>
+              <w:top w:val="single" w:sz="4" w:color="D9D9D9"/>
+              <w:left w:val="single" w:sz="4" w:color="D9D9D9"/>
+              <w:bottom w:val="single" w:sz="4" w:color="D9D9D9"/>
+              <w:right w:val="single" w:sz="4" w:color="D9D9D9"/>
+            </w:tcBorders>
+            <w:tcMar>
+              <w:top w:w="65" w:type="dxa"/>
+              <w:left w:w="65" w:type="dxa"/>
+              <w:bottom w:w="65" w:type="dxa"/>
+              <w:right w:w="65" w:type="dxa"/>
+            </w:tcMar>
+            <w:shd w:fill="F5F6F7"/>
+          </w:tcPr>
+          <w:p>
+            <w:pPr>
+              <w:spacing w:after="0" w:line="240" w:lineRule="auto"/>
+              <w:jc w:val="center"/>
+            </w:pPr>
+            <w:r>
+              <w:rPr>
+                <w:b w:val="0"/>
+                <w:sz w:val="18"/>
+              </w:rPr>
+              <w:t>52</w:t>
+            </w:r>
+          </w:p>
+        </w:tc>
+        <w:tc>
+          <w:tcPr>
+            <w:tcW w:type="dxa" w:w="1631"/>
+            <w:vAlign w:val="center"/>
+            <w:tcBorders>
+              <w:top w:val="single" w:sz="4" w:color="D9D9D9"/>
+              <w:left w:val="single" w:sz="4" w:color="D9D9D9"/>
+              <w:bottom w:val="single" w:sz="4" w:color="D9D9D9"/>
+              <w:right w:val="single" w:sz="4" w:color="D9D9D9"/>
+            </w:tcBorders>
+            <w:tcMar>
+              <w:top w:w="65" w:type="dxa"/>
+              <w:left w:w="65" w:type="dxa"/>
+              <w:bottom w:w="65" w:type="dxa"/>
+              <w:right w:w="65" w:type="dxa"/>
+            </w:tcMar>
+            <w:shd w:fill="F5F6F7"/>
+          </w:tcPr>
+          <w:p>
+            <w:pPr>
+              <w:spacing w:after="0" w:line="240" w:lineRule="auto"/>
+              <w:jc w:val="center"/>
+            </w:pPr>
+            <w:r>
+              <w:rPr>
+                <w:b w:val="0"/>
+                <w:sz w:val="18"/>
+              </w:rPr>
+              <w:t>0.041157</w:t>
+            </w:r>
+          </w:p>
+        </w:tc>
+        <w:tc>
+          <w:tcPr>
+            <w:tcW w:type="dxa" w:w="1631"/>
+            <w:vAlign w:val="center"/>
+            <w:tcBorders>
+              <w:top w:val="single" w:sz="4" w:color="D9D9D9"/>
+              <w:left w:val="single" w:sz="4" w:color="D9D9D9"/>
+              <w:bottom w:val="single" w:sz="4" w:color="D9D9D9"/>
+              <w:right w:val="single" w:sz="4" w:color="D9D9D9"/>
+            </w:tcBorders>
+            <w:tcMar>
+              <w:top w:w="65" w:type="dxa"/>
+              <w:left w:w="65" w:type="dxa"/>
+              <w:bottom w:w="65" w:type="dxa"/>
+              <w:right w:w="65" w:type="dxa"/>
+            </w:tcMar>
+            <w:shd w:fill="F5F6F7"/>
+          </w:tcPr>
+          <w:p>
+            <w:pPr>
+              <w:spacing w:after="0" w:line="240" w:lineRule="auto"/>
+              <w:jc w:val="center"/>
+            </w:pPr>
+            <w:r>
+              <w:rPr>
+                <w:b w:val="0"/>
+                <w:sz w:val="18"/>
+              </w:rPr>
+              <w:t>0.045978</w:t>
+            </w:r>
+          </w:p>
+        </w:tc>
+      </w:tr>
+      <w:tr>
+        <w:trPr>
+          <w:cantSplit/>
+        </w:trPr>
+        <w:tc>
+          <w:tcPr>
+            <w:tcW w:type="dxa" w:w="1733"/>
+            <w:vAlign w:val="center"/>
+            <w:tcBorders>
+              <w:top w:val="single" w:sz="4" w:color="D9D9D9"/>
+              <w:left w:val="single" w:sz="4" w:color="D9D9D9"/>
+              <w:bottom w:val="single" w:sz="4" w:color="D9D9D9"/>
+              <w:right w:val="single" w:sz="4" w:color="D9D9D9"/>
+            </w:tcBorders>
+            <w:tcMar>
+              <w:top w:w="65" w:type="dxa"/>
+              <w:left w:w="65" w:type="dxa"/>
+              <w:bottom w:w="65" w:type="dxa"/>
+              <w:right w:w="65" w:type="dxa"/>
+            </w:tcMar>
+            <w:shd w:fill="FFFFFF"/>
+          </w:tcPr>
+          <w:p>
+            <w:pPr>
+              <w:spacing w:after="0" w:line="240" w:lineRule="auto"/>
+              <w:jc w:val="left"/>
+            </w:pPr>
+            <w:r>
+              <w:rPr>
+                <w:b w:val="0"/>
+                <w:sz w:val="18"/>
+              </w:rPr>
+              <w:t>Stage only</w:t>
+            </w:r>
+          </w:p>
+        </w:tc>
+        <w:tc>
+          <w:tcPr>
+            <w:tcW w:type="dxa" w:w="1733"/>
+            <w:vAlign w:val="center"/>
+            <w:tcBorders>
+              <w:top w:val="single" w:sz="4" w:color="D9D9D9"/>
+              <w:left w:val="single" w:sz="4" w:color="D9D9D9"/>
+              <w:bottom w:val="single" w:sz="4" w:color="D9D9D9"/>
+              <w:right w:val="single" w:sz="4" w:color="D9D9D9"/>
+            </w:tcBorders>
+            <w:tcMar>
+              <w:top w:w="65" w:type="dxa"/>
+              <w:left w:w="65" w:type="dxa"/>
+              <w:bottom w:w="65" w:type="dxa"/>
+              <w:right w:w="65" w:type="dxa"/>
+            </w:tcMar>
+            <w:shd w:fill="FFFFFF"/>
+          </w:tcPr>
+          <w:p>
+            <w:pPr>
+              <w:spacing w:after="0" w:line="240" w:lineRule="auto"/>
+              <w:jc w:val="center"/>
+            </w:pPr>
+            <w:r>
+              <w:rPr>
+                <w:b w:val="0"/>
+                <w:sz w:val="18"/>
+              </w:rPr>
+              <w:t>20261012</w:t>
+            </w:r>
+          </w:p>
+        </w:tc>
+        <w:tc>
+          <w:tcPr>
+            <w:tcW w:type="dxa" w:w="1393"/>
+            <w:vAlign w:val="center"/>
+            <w:tcBorders>
+              <w:top w:val="single" w:sz="4" w:color="D9D9D9"/>
+              <w:left w:val="single" w:sz="4" w:color="D9D9D9"/>
+              <w:bottom w:val="single" w:sz="4" w:color="D9D9D9"/>
+              <w:right w:val="single" w:sz="4" w:color="D9D9D9"/>
+            </w:tcBorders>
+            <w:tcMar>
+              <w:top w:w="65" w:type="dxa"/>
+              <w:left w:w="65" w:type="dxa"/>
+              <w:bottom w:w="65" w:type="dxa"/>
+              <w:right w:w="65" w:type="dxa"/>
+            </w:tcMar>
+            <w:shd w:fill="FFFFFF"/>
+          </w:tcPr>
+          <w:p>
+            <w:pPr>
+              <w:spacing w:after="0" w:line="240" w:lineRule="auto"/>
+              <w:jc w:val="center"/>
+            </w:pPr>
+            <w:r>
+              <w:rPr>
+                <w:b w:val="0"/>
+                <w:sz w:val="18"/>
+              </w:rPr>
+              <w:t>55</w:t>
+            </w:r>
+          </w:p>
+        </w:tc>
+        <w:tc>
+          <w:tcPr>
+            <w:tcW w:type="dxa" w:w="1291"/>
+            <w:vAlign w:val="center"/>
+            <w:tcBorders>
+              <w:top w:val="single" w:sz="4" w:color="D9D9D9"/>
+              <w:left w:val="single" w:sz="4" w:color="D9D9D9"/>
+              <w:bottom w:val="single" w:sz="4" w:color="D9D9D9"/>
+              <w:right w:val="single" w:sz="4" w:color="D9D9D9"/>
+            </w:tcBorders>
+            <w:tcMar>
+              <w:top w:w="65" w:type="dxa"/>
+              <w:left w:w="65" w:type="dxa"/>
+              <w:bottom w:w="65" w:type="dxa"/>
+              <w:right w:w="65" w:type="dxa"/>
+            </w:tcMar>
+            <w:shd w:fill="FFFFFF"/>
+          </w:tcPr>
+          <w:p>
+            <w:pPr>
+              <w:spacing w:after="0" w:line="240" w:lineRule="auto"/>
+              <w:jc w:val="center"/>
+            </w:pPr>
+            <w:r>
+              <w:rPr>
+                <w:b w:val="0"/>
+                <w:sz w:val="18"/>
+              </w:rPr>
+              <w:t>40</w:t>
+            </w:r>
+          </w:p>
+        </w:tc>
+        <w:tc>
+          <w:tcPr>
+            <w:tcW w:type="dxa" w:w="1631"/>
+            <w:vAlign w:val="center"/>
+            <w:tcBorders>
+              <w:top w:val="single" w:sz="4" w:color="D9D9D9"/>
+              <w:left w:val="single" w:sz="4" w:color="D9D9D9"/>
+              <w:bottom w:val="single" w:sz="4" w:color="D9D9D9"/>
+              <w:right w:val="single" w:sz="4" w:color="D9D9D9"/>
+            </w:tcBorders>
+            <w:tcMar>
+              <w:top w:w="65" w:type="dxa"/>
+              <w:left w:w="65" w:type="dxa"/>
+              <w:bottom w:w="65" w:type="dxa"/>
+              <w:right w:w="65" w:type="dxa"/>
+            </w:tcMar>
+            <w:shd w:fill="FFFFFF"/>
+          </w:tcPr>
+          <w:p>
+            <w:pPr>
+              <w:spacing w:after="0" w:line="240" w:lineRule="auto"/>
+              <w:jc w:val="center"/>
+            </w:pPr>
+            <w:r>
+              <w:rPr>
+                <w:b w:val="0"/>
+                <w:sz w:val="18"/>
+              </w:rPr>
+              <w:t>0.035196</w:t>
+            </w:r>
+          </w:p>
+        </w:tc>
+        <w:tc>
+          <w:tcPr>
+            <w:tcW w:type="dxa" w:w="1631"/>
+            <w:vAlign w:val="center"/>
+            <w:tcBorders>
+              <w:top w:val="single" w:sz="4" w:color="D9D9D9"/>
+              <w:left w:val="single" w:sz="4" w:color="D9D9D9"/>
+              <w:bottom w:val="single" w:sz="4" w:color="D9D9D9"/>
+              <w:right w:val="single" w:sz="4" w:color="D9D9D9"/>
+            </w:tcBorders>
+            <w:tcMar>
+              <w:top w:w="65" w:type="dxa"/>
+              <w:left w:w="65" w:type="dxa"/>
+              <w:bottom w:w="65" w:type="dxa"/>
+              <w:right w:w="65" w:type="dxa"/>
+            </w:tcMar>
+            <w:shd w:fill="FFFFFF"/>
+          </w:tcPr>
+          <w:p>
+            <w:pPr>
+              <w:spacing w:after="0" w:line="240" w:lineRule="auto"/>
+              <w:jc w:val="center"/>
+            </w:pPr>
+            <w:r>
+              <w:rPr>
+                <w:b w:val="0"/>
+                <w:sz w:val="18"/>
+              </w:rPr>
+              <w:t>0.037724</w:t>
+            </w:r>
+          </w:p>
+        </w:tc>
+      </w:tr>
+      <w:tr>
+        <w:trPr>
+          <w:cantSplit/>
+        </w:trPr>
+        <w:tc>
+          <w:tcPr>
+            <w:tcW w:type="dxa" w:w="1733"/>
+            <w:vAlign w:val="center"/>
+            <w:tcBorders>
+              <w:top w:val="single" w:sz="4" w:color="D9D9D9"/>
+              <w:left w:val="single" w:sz="4" w:color="D9D9D9"/>
+              <w:bottom w:val="single" w:sz="4" w:color="D9D9D9"/>
+              <w:right w:val="single" w:sz="4" w:color="D9D9D9"/>
+            </w:tcBorders>
+            <w:tcMar>
+              <w:top w:w="65" w:type="dxa"/>
+              <w:left w:w="65" w:type="dxa"/>
+              <w:bottom w:w="65" w:type="dxa"/>
+              <w:right w:w="65" w:type="dxa"/>
+            </w:tcMar>
+            <w:shd w:fill="F5F6F7"/>
+          </w:tcPr>
+          <w:p>
+            <w:pPr>
+              <w:spacing w:after="0" w:line="240" w:lineRule="auto"/>
+              <w:jc w:val="left"/>
+            </w:pPr>
+            <w:r>
+              <w:rPr>
+                <w:b w:val="0"/>
+                <w:sz w:val="18"/>
+              </w:rPr>
+              <w:t>Multitask</w:t>
+            </w:r>
+          </w:p>
+        </w:tc>
+        <w:tc>
+          <w:tcPr>
+            <w:tcW w:type="dxa" w:w="1733"/>
+            <w:vAlign w:val="center"/>
+            <w:tcBorders>
+              <w:top w:val="single" w:sz="4" w:color="D9D9D9"/>
+              <w:left w:val="single" w:sz="4" w:color="D9D9D9"/>
+              <w:bottom w:val="single" w:sz="4" w:color="D9D9D9"/>
+              <w:right w:val="single" w:sz="4" w:color="D9D9D9"/>
+            </w:tcBorders>
+            <w:tcMar>
+              <w:top w:w="65" w:type="dxa"/>
+              <w:left w:w="65" w:type="dxa"/>
+              <w:bottom w:w="65" w:type="dxa"/>
+              <w:right w:w="65" w:type="dxa"/>
+            </w:tcMar>
+            <w:shd w:fill="F5F6F7"/>
+          </w:tcPr>
+          <w:p>
+            <w:pPr>
+              <w:spacing w:after="0" w:line="240" w:lineRule="auto"/>
+              <w:jc w:val="center"/>
+            </w:pPr>
+            <w:r>
+              <w:rPr>
+                <w:b w:val="0"/>
+                <w:sz w:val="18"/>
+              </w:rPr>
+              <w:t>20261012</w:t>
+            </w:r>
+          </w:p>
+        </w:tc>
+        <w:tc>
+          <w:tcPr>
+            <w:tcW w:type="dxa" w:w="1393"/>
+            <w:vAlign w:val="center"/>
+            <w:tcBorders>
+              <w:top w:val="single" w:sz="4" w:color="D9D9D9"/>
+              <w:left w:val="single" w:sz="4" w:color="D9D9D9"/>
+              <w:bottom w:val="single" w:sz="4" w:color="D9D9D9"/>
+              <w:right w:val="single" w:sz="4" w:color="D9D9D9"/>
+            </w:tcBorders>
+            <w:tcMar>
+              <w:top w:w="65" w:type="dxa"/>
+              <w:left w:w="65" w:type="dxa"/>
+              <w:bottom w:w="65" w:type="dxa"/>
+              <w:right w:w="65" w:type="dxa"/>
+            </w:tcMar>
+            <w:shd w:fill="F5F6F7"/>
+          </w:tcPr>
+          <w:p>
+            <w:pPr>
+              <w:spacing w:after="0" w:line="240" w:lineRule="auto"/>
+              <w:jc w:val="center"/>
+            </w:pPr>
+            <w:r>
+              <w:rPr>
+                <w:b w:val="0"/>
+                <w:sz w:val="18"/>
+              </w:rPr>
+              <w:t>75</w:t>
+            </w:r>
+          </w:p>
+        </w:tc>
+        <w:tc>
+          <w:tcPr>
+            <w:tcW w:type="dxa" w:w="1291"/>
+            <w:vAlign w:val="center"/>
+            <w:tcBorders>
+              <w:top w:val="single" w:sz="4" w:color="D9D9D9"/>
+              <w:left w:val="single" w:sz="4" w:color="D9D9D9"/>
+              <w:bottom w:val="single" w:sz="4" w:color="D9D9D9"/>
+              <w:right w:val="single" w:sz="4" w:color="D9D9D9"/>
+            </w:tcBorders>
+            <w:tcMar>
+              <w:top w:w="65" w:type="dxa"/>
+              <w:left w:w="65" w:type="dxa"/>
+              <w:bottom w:w="65" w:type="dxa"/>
+              <w:right w:w="65" w:type="dxa"/>
+            </w:tcMar>
+            <w:shd w:fill="F5F6F7"/>
+          </w:tcPr>
+          <w:p>
+            <w:pPr>
+              <w:spacing w:after="0" w:line="240" w:lineRule="auto"/>
+              <w:jc w:val="center"/>
+            </w:pPr>
+            <w:r>
+              <w:rPr>
+                <w:b w:val="0"/>
+                <w:sz w:val="18"/>
+              </w:rPr>
+              <w:t>60</w:t>
+            </w:r>
+          </w:p>
+        </w:tc>
+        <w:tc>
+          <w:tcPr>
+            <w:tcW w:type="dxa" w:w="1631"/>
+            <w:vAlign w:val="center"/>
+            <w:tcBorders>
+              <w:top w:val="single" w:sz="4" w:color="D9D9D9"/>
+              <w:left w:val="single" w:sz="4" w:color="D9D9D9"/>
+              <w:bottom w:val="single" w:sz="4" w:color="D9D9D9"/>
+              <w:right w:val="single" w:sz="4" w:color="D9D9D9"/>
+            </w:tcBorders>
+            <w:tcMar>
+              <w:top w:w="65" w:type="dxa"/>
+              <w:left w:w="65" w:type="dxa"/>
+              <w:bottom w:w="65" w:type="dxa"/>
+              <w:right w:w="65" w:type="dxa"/>
+            </w:tcMar>
+            <w:shd w:fill="F5F6F7"/>
+          </w:tcPr>
+          <w:p>
+            <w:pPr>
+              <w:spacing w:after="0" w:line="240" w:lineRule="auto"/>
+              <w:jc w:val="center"/>
+            </w:pPr>
+            <w:r>
+              <w:rPr>
+                <w:b w:val="0"/>
+                <w:sz w:val="18"/>
+              </w:rPr>
+              <w:t>0.042489</w:t>
+            </w:r>
+          </w:p>
+        </w:tc>
+        <w:tc>
+          <w:tcPr>
+            <w:tcW w:type="dxa" w:w="1631"/>
+            <w:vAlign w:val="center"/>
+            <w:tcBorders>
+              <w:top w:val="single" w:sz="4" w:color="D9D9D9"/>
+              <w:left w:val="single" w:sz="4" w:color="D9D9D9"/>
+              <w:bottom w:val="single" w:sz="4" w:color="D9D9D9"/>
+              <w:right w:val="single" w:sz="4" w:color="D9D9D9"/>
+            </w:tcBorders>
+            <w:tcMar>
+              <w:top w:w="65" w:type="dxa"/>
+              <w:left w:w="65" w:type="dxa"/>
+              <w:bottom w:w="65" w:type="dxa"/>
+              <w:right w:w="65" w:type="dxa"/>
+            </w:tcMar>
+            <w:shd w:fill="F5F6F7"/>
+          </w:tcPr>
+          <w:p>
+            <w:pPr>
+              <w:spacing w:after="0" w:line="240" w:lineRule="auto"/>
+              <w:jc w:val="center"/>
+            </w:pPr>
+            <w:r>
+              <w:rPr>
+                <w:b w:val="0"/>
+                <w:sz w:val="18"/>
+              </w:rPr>
+              <w:t>0.048810</w:t>
+            </w:r>
+          </w:p>
+        </w:tc>
+      </w:tr>
+      <w:tr>
+        <w:trPr>
+          <w:cantSplit/>
+        </w:trPr>
+        <w:tc>
+          <w:tcPr>
+            <w:tcW w:type="dxa" w:w="1733"/>
+            <w:vAlign w:val="center"/>
+            <w:tcBorders>
+              <w:top w:val="single" w:sz="4" w:color="D9D9D9"/>
+              <w:left w:val="single" w:sz="4" w:color="D9D9D9"/>
+              <w:bottom w:val="single" w:sz="4" w:color="D9D9D9"/>
+              <w:right w:val="single" w:sz="4" w:color="D9D9D9"/>
+            </w:tcBorders>
+            <w:tcMar>
+              <w:top w:w="65" w:type="dxa"/>
+              <w:left w:w="65" w:type="dxa"/>
+              <w:bottom w:w="65" w:type="dxa"/>
+              <w:right w:w="65" w:type="dxa"/>
+            </w:tcMar>
+            <w:shd w:fill="FFFFFF"/>
+          </w:tcPr>
+          <w:p>
+            <w:pPr>
+              <w:spacing w:after="0" w:line="240" w:lineRule="auto"/>
+              <w:jc w:val="left"/>
+            </w:pPr>
+            <w:r>
+              <w:rPr>
+                <w:b w:val="0"/>
+                <w:sz w:val="18"/>
+              </w:rPr>
+              <w:t>Stage only</w:t>
+            </w:r>
+          </w:p>
+        </w:tc>
+        <w:tc>
+          <w:tcPr>
+            <w:tcW w:type="dxa" w:w="1733"/>
+            <w:vAlign w:val="center"/>
+            <w:tcBorders>
+              <w:top w:val="single" w:sz="4" w:color="D9D9D9"/>
+              <w:left w:val="single" w:sz="4" w:color="D9D9D9"/>
+              <w:bottom w:val="single" w:sz="4" w:color="D9D9D9"/>
+              <w:right w:val="single" w:sz="4" w:color="D9D9D9"/>
+            </w:tcBorders>
+            <w:tcMar>
+              <w:top w:w="65" w:type="dxa"/>
+              <w:left w:w="65" w:type="dxa"/>
+              <w:bottom w:w="65" w:type="dxa"/>
+              <w:right w:w="65" w:type="dxa"/>
+            </w:tcMar>
+            <w:shd w:fill="FFFFFF"/>
+          </w:tcPr>
+          <w:p>
+            <w:pPr>
+              <w:spacing w:after="0" w:line="240" w:lineRule="auto"/>
+              <w:jc w:val="center"/>
+            </w:pPr>
+            <w:r>
+              <w:rPr>
+                <w:b w:val="0"/>
+                <w:sz w:val="18"/>
+              </w:rPr>
+              <w:t>20261013</w:t>
+            </w:r>
+          </w:p>
+        </w:tc>
+        <w:tc>
+          <w:tcPr>
+            <w:tcW w:type="dxa" w:w="1393"/>
+            <w:vAlign w:val="center"/>
+            <w:tcBorders>
+              <w:top w:val="single" w:sz="4" w:color="D9D9D9"/>
+              <w:left w:val="single" w:sz="4" w:color="D9D9D9"/>
+              <w:bottom w:val="single" w:sz="4" w:color="D9D9D9"/>
+              <w:right w:val="single" w:sz="4" w:color="D9D9D9"/>
+            </w:tcBorders>
+            <w:tcMar>
+              <w:top w:w="65" w:type="dxa"/>
+              <w:left w:w="65" w:type="dxa"/>
+              <w:bottom w:w="65" w:type="dxa"/>
+              <w:right w:w="65" w:type="dxa"/>
+            </w:tcMar>
+            <w:shd w:fill="FFFFFF"/>
+          </w:tcPr>
+          <w:p>
+            <w:pPr>
+              <w:spacing w:after="0" w:line="240" w:lineRule="auto"/>
+              <w:jc w:val="center"/>
+            </w:pPr>
+            <w:r>
+              <w:rPr>
+                <w:b w:val="0"/>
+                <w:sz w:val="18"/>
+              </w:rPr>
+              <w:t>40</w:t>
+            </w:r>
+          </w:p>
+        </w:tc>
+        <w:tc>
+          <w:tcPr>
+            <w:tcW w:type="dxa" w:w="1291"/>
+            <w:vAlign w:val="center"/>
+            <w:tcBorders>
+              <w:top w:val="single" w:sz="4" w:color="D9D9D9"/>
+              <w:left w:val="single" w:sz="4" w:color="D9D9D9"/>
+              <w:bottom w:val="single" w:sz="4" w:color="D9D9D9"/>
+              <w:right w:val="single" w:sz="4" w:color="D9D9D9"/>
+            </w:tcBorders>
+            <w:tcMar>
+              <w:top w:w="65" w:type="dxa"/>
+              <w:left w:w="65" w:type="dxa"/>
+              <w:bottom w:w="65" w:type="dxa"/>
+              <w:right w:w="65" w:type="dxa"/>
+            </w:tcMar>
+            <w:shd w:fill="FFFFFF"/>
+          </w:tcPr>
+          <w:p>
+            <w:pPr>
+              <w:spacing w:after="0" w:line="240" w:lineRule="auto"/>
+              <w:jc w:val="center"/>
+            </w:pPr>
+            <w:r>
+              <w:rPr>
+                <w:b w:val="0"/>
+                <w:sz w:val="18"/>
+              </w:rPr>
+              <w:t>25</w:t>
+            </w:r>
+          </w:p>
+        </w:tc>
+        <w:tc>
+          <w:tcPr>
+            <w:tcW w:type="dxa" w:w="1631"/>
+            <w:vAlign w:val="center"/>
+            <w:tcBorders>
+              <w:top w:val="single" w:sz="4" w:color="D9D9D9"/>
+              <w:left w:val="single" w:sz="4" w:color="D9D9D9"/>
+              <w:bottom w:val="single" w:sz="4" w:color="D9D9D9"/>
+              <w:right w:val="single" w:sz="4" w:color="D9D9D9"/>
+            </w:tcBorders>
+            <w:tcMar>
+              <w:top w:w="65" w:type="dxa"/>
+              <w:left w:w="65" w:type="dxa"/>
+              <w:bottom w:w="65" w:type="dxa"/>
+              <w:right w:w="65" w:type="dxa"/>
+            </w:tcMar>
+            <w:shd w:fill="FFFFFF"/>
+          </w:tcPr>
+          <w:p>
+            <w:pPr>
+              <w:spacing w:after="0" w:line="240" w:lineRule="auto"/>
+              <w:jc w:val="center"/>
+            </w:pPr>
+            <w:r>
+              <w:rPr>
+                <w:b w:val="0"/>
+                <w:sz w:val="18"/>
+              </w:rPr>
+              <w:t>0.035889</w:t>
+            </w:r>
+          </w:p>
+        </w:tc>
+        <w:tc>
+          <w:tcPr>
+            <w:tcW w:type="dxa" w:w="1631"/>
+            <w:vAlign w:val="center"/>
+            <w:tcBorders>
+              <w:top w:val="single" w:sz="4" w:color="D9D9D9"/>
+              <w:left w:val="single" w:sz="4" w:color="D9D9D9"/>
+              <w:bottom w:val="single" w:sz="4" w:color="D9D9D9"/>
+              <w:right w:val="single" w:sz="4" w:color="D9D9D9"/>
+            </w:tcBorders>
+            <w:tcMar>
+              <w:top w:w="65" w:type="dxa"/>
+              <w:left w:w="65" w:type="dxa"/>
+              <w:bottom w:w="65" w:type="dxa"/>
+              <w:right w:w="65" w:type="dxa"/>
+            </w:tcMar>
+            <w:shd w:fill="FFFFFF"/>
+          </w:tcPr>
+          <w:p>
+            <w:pPr>
+              <w:spacing w:after="0" w:line="240" w:lineRule="auto"/>
+              <w:jc w:val="center"/>
+            </w:pPr>
+            <w:r>
+              <w:rPr>
+                <w:b w:val="0"/>
+                <w:sz w:val="18"/>
+              </w:rPr>
+              <w:t>0.038450</w:t>
+            </w:r>
+          </w:p>
+        </w:tc>
+      </w:tr>
+      <w:tr>
+        <w:trPr>
+          <w:cantSplit/>
+        </w:trPr>
+        <w:tc>
+          <w:tcPr>
+            <w:tcW w:type="dxa" w:w="1733"/>
+            <w:vAlign w:val="center"/>
+            <w:tcBorders>
+              <w:top w:val="single" w:sz="4" w:color="D9D9D9"/>
+              <w:left w:val="single" w:sz="4" w:color="D9D9D9"/>
+              <w:bottom w:val="single" w:sz="4" w:color="D9D9D9"/>
+              <w:right w:val="single" w:sz="4" w:color="D9D9D9"/>
+            </w:tcBorders>
+            <w:tcMar>
+              <w:top w:w="65" w:type="dxa"/>
+              <w:left w:w="65" w:type="dxa"/>
+              <w:bottom w:w="65" w:type="dxa"/>
+              <w:right w:w="65" w:type="dxa"/>
+            </w:tcMar>
+            <w:shd w:fill="F5F6F7"/>
+          </w:tcPr>
+          <w:p>
+            <w:pPr>
+              <w:spacing w:after="0" w:line="240" w:lineRule="auto"/>
+              <w:jc w:val="left"/>
+            </w:pPr>
+            <w:r>
+              <w:rPr>
+                <w:b w:val="0"/>
+                <w:sz w:val="18"/>
+              </w:rPr>
+              <w:t>Multitask</w:t>
+            </w:r>
+          </w:p>
+        </w:tc>
+        <w:tc>
+          <w:tcPr>
+            <w:tcW w:type="dxa" w:w="1733"/>
+            <w:vAlign w:val="center"/>
+            <w:tcBorders>
+              <w:top w:val="single" w:sz="4" w:color="D9D9D9"/>
+              <w:left w:val="single" w:sz="4" w:color="D9D9D9"/>
+              <w:bottom w:val="single" w:sz="4" w:color="D9D9D9"/>
+              <w:right w:val="single" w:sz="4" w:color="D9D9D9"/>
+            </w:tcBorders>
+            <w:tcMar>
+              <w:top w:w="65" w:type="dxa"/>
+              <w:left w:w="65" w:type="dxa"/>
+              <w:bottom w:w="65" w:type="dxa"/>
+              <w:right w:w="65" w:type="dxa"/>
+            </w:tcMar>
+            <w:shd w:fill="F5F6F7"/>
+          </w:tcPr>
+          <w:p>
+            <w:pPr>
+              <w:spacing w:after="0" w:line="240" w:lineRule="auto"/>
+              <w:jc w:val="center"/>
+            </w:pPr>
+            <w:r>
+              <w:rPr>
+                <w:b w:val="0"/>
+                <w:sz w:val="18"/>
+              </w:rPr>
+              <w:t>20261013</w:t>
+            </w:r>
+          </w:p>
+        </w:tc>
+        <w:tc>
+          <w:tcPr>
+            <w:tcW w:type="dxa" w:w="1393"/>
+            <w:vAlign w:val="center"/>
+            <w:tcBorders>
+              <w:top w:val="single" w:sz="4" w:color="D9D9D9"/>
+              <w:left w:val="single" w:sz="4" w:color="D9D9D9"/>
+              <w:bottom w:val="single" w:sz="4" w:color="D9D9D9"/>
+              <w:right w:val="single" w:sz="4" w:color="D9D9D9"/>
+            </w:tcBorders>
+            <w:tcMar>
+              <w:top w:w="65" w:type="dxa"/>
+              <w:left w:w="65" w:type="dxa"/>
+              <w:bottom w:w="65" w:type="dxa"/>
+              <w:right w:w="65" w:type="dxa"/>
+            </w:tcMar>
+            <w:shd w:fill="F5F6F7"/>
+          </w:tcPr>
+          <w:p>
+            <w:pPr>
+              <w:spacing w:after="0" w:line="240" w:lineRule="auto"/>
+              <w:jc w:val="center"/>
+            </w:pPr>
+            <w:r>
+              <w:rPr>
+                <w:b w:val="0"/>
+                <w:sz w:val="18"/>
+              </w:rPr>
+              <w:t>50</w:t>
+            </w:r>
+          </w:p>
+        </w:tc>
+        <w:tc>
+          <w:tcPr>
+            <w:tcW w:type="dxa" w:w="1291"/>
+            <w:vAlign w:val="center"/>
+            <w:tcBorders>
+              <w:top w:val="single" w:sz="4" w:color="D9D9D9"/>
+              <w:left w:val="single" w:sz="4" w:color="D9D9D9"/>
+              <w:bottom w:val="single" w:sz="4" w:color="D9D9D9"/>
+              <w:right w:val="single" w:sz="4" w:color="D9D9D9"/>
+            </w:tcBorders>
+            <w:tcMar>
+              <w:top w:w="65" w:type="dxa"/>
+              <w:left w:w="65" w:type="dxa"/>
+              <w:bottom w:w="65" w:type="dxa"/>
+              <w:right w:w="65" w:type="dxa"/>
+            </w:tcMar>
+            <w:shd w:fill="F5F6F7"/>
+          </w:tcPr>
+          <w:p>
+            <w:pPr>
+              <w:spacing w:after="0" w:line="240" w:lineRule="auto"/>
+              <w:jc w:val="center"/>
+            </w:pPr>
+            <w:r>
+              <w:rPr>
+                <w:b w:val="0"/>
+                <w:sz w:val="18"/>
+              </w:rPr>
+              <w:t>35</w:t>
+            </w:r>
+          </w:p>
+        </w:tc>
+        <w:tc>
+          <w:tcPr>
+            <w:tcW w:type="dxa" w:w="1631"/>
+            <w:vAlign w:val="center"/>
+            <w:tcBorders>
+              <w:top w:val="single" w:sz="4" w:color="D9D9D9"/>
+              <w:left w:val="single" w:sz="4" w:color="D9D9D9"/>
+              <w:bottom w:val="single" w:sz="4" w:color="D9D9D9"/>
+              <w:right w:val="single" w:sz="4" w:color="D9D9D9"/>
+            </w:tcBorders>
+            <w:tcMar>
+              <w:top w:w="65" w:type="dxa"/>
+              <w:left w:w="65" w:type="dxa"/>
+              <w:bottom w:w="65" w:type="dxa"/>
+              <w:right w:w="65" w:type="dxa"/>
+            </w:tcMar>
+            <w:shd w:fill="F5F6F7"/>
+          </w:tcPr>
+          <w:p>
+            <w:pPr>
+              <w:spacing w:after="0" w:line="240" w:lineRule="auto"/>
+              <w:jc w:val="center"/>
+            </w:pPr>
+            <w:r>
+              <w:rPr>
+                <w:b w:val="0"/>
+                <w:sz w:val="18"/>
+              </w:rPr>
+              <w:t>0.044689</w:t>
+            </w:r>
+          </w:p>
+        </w:tc>
+        <w:tc>
+          <w:tcPr>
+            <w:tcW w:type="dxa" w:w="1631"/>
+            <w:vAlign w:val="center"/>
+            <w:tcBorders>
+              <w:top w:val="single" w:sz="4" w:color="D9D9D9"/>
+              <w:left w:val="single" w:sz="4" w:color="D9D9D9"/>
+              <w:bottom w:val="single" w:sz="4" w:color="D9D9D9"/>
+              <w:right w:val="single" w:sz="4" w:color="D9D9D9"/>
+            </w:tcBorders>
+            <w:tcMar>
+              <w:top w:w="65" w:type="dxa"/>
+              <w:left w:w="65" w:type="dxa"/>
+              <w:bottom w:w="65" w:type="dxa"/>
+              <w:right w:w="65" w:type="dxa"/>
+            </w:tcMar>
+            <w:shd w:fill="F5F6F7"/>
+          </w:tcPr>
+          <w:p>
+            <w:pPr>
+              <w:spacing w:after="0" w:line="240" w:lineRule="auto"/>
+              <w:jc w:val="center"/>
+            </w:pPr>
+            <w:r>
+              <w:rPr>
+                <w:b w:val="0"/>
+                <w:sz w:val="18"/>
+              </w:rPr>
+              <w:t>0.049141</w:t>
+            </w:r>
+          </w:p>
+        </w:tc>
+      </w:tr>
+    </w:tbl>
+    <w:p>
+      <w:pPr>
+        <w:spacing w:after="20"/>
+      </w:pPr>
+    </w:p>
+    <w:p>
+      <w:pPr>
+        <w:keepNext/>
+        <w:jc w:val="center"/>
+      </w:pPr>
+      <w:r>
+        <w:drawing>
+          <wp:inline xmlns:a="http://schemas.openxmlformats.org/drawingml/2006/main" xmlns:pic="http://schemas.openxmlformats.org/drawingml/2006/picture">
+            <wp:extent cx="5852160" cy="3526357"/>
+            <wp:docPr id="3" name="Picture 3"/>
+            <wp:cNvGraphicFramePr>
+              <a:graphicFrameLocks noChangeAspect="1"/>
+            </wp:cNvGraphicFramePr>
+            <a:graphic>
+              <a:graphicData uri="http://schemas.openxmlformats.org/drawingml/2006/picture">
+                <pic:pic>
+                  <pic:nvPicPr>
+                    <pic:cNvPr id="0" name="matched_clean_nll.png"/>
+                    <pic:cNvPicPr/>
+                  </pic:nvPicPr>
+                  <pic:blipFill>
+                    <a:blip r:embed="rId19"/>
+                    <a:stretch>
+                      <a:fillRect/>
+                    </a:stretch>
+                  </pic:blipFill>
+                  <pic:spPr>
+                    <a:xfrm>
+                      <a:off x="0" y="0"/>
+                      <a:ext cx="5852160" cy="3526357"/>
+                    </a:xfrm>
+                    <a:prstGeom prst="rect"/>
+                  </pic:spPr>
+                </pic:pic>
+              </a:graphicData>
+            </a:graphic>
+          </wp:inline>
+        </w:drawing>
+      </w:r>
+    </w:p>
+    <w:p>
+      <w:pPr>
+        <w:pStyle w:val="Caption"/>
+      </w:pPr>
+      <w:r>
+        <w:t>Figure 3. New epoch-end clean training and validation NLL for all six runs. Dashed lines identify validation-selected checkpoints. Both curves use the same measurement procedure; training remains resubstitution. Raw observations are shown without smoothing or interpolation.</w:t>
+      </w:r>
+    </w:p>
+    <w:p>
+      <w:r>
+        <w:br w:type="page"/>
+      </w:r>
+    </w:p>
+    <w:p>
+      <w:pPr>
+        <w:pStyle w:val="Heading1"/>
+      </w:pPr>
+      <w:r>
+        <w:t>Clinical auxiliary curves and interpretation</w:t>
+      </w:r>
+    </w:p>
+    <w:p>
+      <w:pPr/>
+      <w:r>
+        <w:t>For the multitask runs, clinical loss was calculated after averaging slice probabilities within each subject: 32 training subjects and 11 validation subjects. These clean subject-level curves use the same evaluation procedure across splits. Clinical loss did not select the stage checkpoint.</w:t>
+      </w:r>
+    </w:p>
+    <w:p>
+      <w:pPr>
+        <w:keepNext/>
+        <w:jc w:val="center"/>
+      </w:pPr>
+      <w:r>
+        <w:drawing>
+          <wp:inline xmlns:a="http://schemas.openxmlformats.org/drawingml/2006/main" xmlns:pic="http://schemas.openxmlformats.org/drawingml/2006/picture">
+            <wp:extent cx="5852160" cy="1977256"/>
+            <wp:docPr id="4" name="Picture 4"/>
+            <wp:cNvGraphicFramePr>
+              <a:graphicFrameLocks noChangeAspect="1"/>
+            </wp:cNvGraphicFramePr>
+            <a:graphic>
+              <a:graphicData uri="http://schemas.openxmlformats.org/drawingml/2006/picture">
+                <pic:pic>
+                  <pic:nvPicPr>
+                    <pic:cNvPr id="0" name="clinical_clean_nll.png"/>
+                    <pic:cNvPicPr/>
+                  </pic:nvPicPr>
+                  <pic:blipFill>
+                    <a:blip r:embed="rId20"/>
+                    <a:stretch>
+                      <a:fillRect/>
+                    </a:stretch>
+                  </pic:blipFill>
+                  <pic:spPr>
+                    <a:xfrm>
+                      <a:off x="0" y="0"/>
+                      <a:ext cx="5852160" cy="1977256"/>
+                    </a:xfrm>
+                    <a:prstGeom prst="rect"/>
+                  </pic:spPr>
+                </pic:pic>
+              </a:graphicData>
+            </a:graphic>
+          </wp:inline>
+        </w:drawing>
+      </w:r>
+    </w:p>
+    <w:p>
+      <w:pPr>
+        <w:pStyle w:val="Caption"/>
+      </w:pPr>
+      <w:r>
+        <w:t>Figure 4. New clean clinical auxiliary NLL for the three multitask seeds, scored after subject-level probability aggregation. Dashed lines show the epoch selected by stage-validation NLL. No held-out or external clinical result is presented.</w:t>
+      </w:r>
+    </w:p>
+    <w:p>
+      <w:pPr>
+        <w:pStyle w:val="Heading1"/>
+      </w:pPr>
+      <w:r>
+        <w:t>Training controls and validation selection</w:t>
+      </w:r>
+    </w:p>
+    <w:p>
+      <w:pPr/>
+      <w:r>
+        <w:t>The verified training configuration used a maximum of 100 epochs, a minimum of 20, patience of 15 epochs and a required validation-NLL improvement greater than 0.0001. Inputs were 224 by 224 pixels with batch size 32. AdamW used learning rate 0.0001 and weight decay 0.001; label smoothing was 0.05. The multitask auxiliary objective had weight 0.25 and was added every 4 stage batches.</w:t>
+      </w:r>
+    </w:p>
+    <w:p>
+      <w:pPr/>
+      <w:r>
+        <w:t>The validation-only preferred condition was stage-only; its representative used seed 20261011 and epoch 27. This preference used mean selected stage-validation NLL across the three seeds and then the lowest validation NLL within that condition. All six runs remain reported. Online training NLL measured augmented images with changing parameters; the weighted, smoothed optimization objective was logged separately and is not substituted for the clean NLL curves.</w:t>
+      </w:r>
+    </w:p>
+    <w:p>
+      <w:pPr>
+        <w:pStyle w:val="Heading1"/>
+      </w:pPr>
+      <w:r>
+        <w:t>Evidence boundaries and provenance</w:t>
+      </w:r>
+    </w:p>
+    <w:p>
+      <w:pPr/>
+      <w:r>
+        <w:t>Training loss is resubstitution, and validation was used for selection. These new learning curves do not supply independent test performance, demonstrate clinical superiority or establish readiness for clinical use. They do not revise the historical benchmark estimates. Image-similarity groups do not establish patient independence, and the clinical training and validation samples remain small.</w:t>
+      </w:r>
+    </w:p>
+    <w:p>
+      <w:pPr/>
+      <w:r>
+        <w:t>The source report checked all six completed histories, per-epoch clean evaluation records, denominators, stopping decisions and validation-only selection. All 12 retrieved checkpoint file hashes were verified. Stage and clinical manifest IDs and group separation were independently checked. The machine-readable report records source hashes; the appended figures were checked against its figure hashes. Report SHA256 begins 80a7bedf6a3d273e; full provenance is retained in report.json and summary.csv.</w:t>
+      </w:r>
+    </w:p>
     <w:sectPr>
-      <w:footerReference w:type="default" r:id="rId19"/>
+      <w:footerReference w:type="default" r:id="rId21"/>
       <w:pgSz w:w="12240" w:h="15840"/>
       <w:pgMar w:top="936" w:right="1080" w:bottom="936" w:left="1080" w:header="720" w:footer="720" w:gutter="0"/>
       <w:cols w:space="720"/>

</xml_diff>